<commit_message>
Regenerate checklist docx with post-removal content; complete [18] purge across all deliverables
The Submission_Checklist_ITEES.docx generator (gen_itees_docs.js) still carried pre-removal text: a to-do item about the deleted 'Entry [18] venue' and two '39 references/entries' counts. Fixed the generator, regenerated all three ITEES docx, rebuilt ITEES_Submission_Package.zip, restored check_doi.py/gh_discover.py helper scripts lost in the branch switch, and added check_docx.py verification. Verification sweep: all 3 manuscript PDFs 38 refs and free of the removed citation; zip tex contains only a source comment; zip PDF clean; checklist/cover-letter PDFs clean; all 3 docx clean.
</commit_message>
<xml_diff>
--- a/download/Submission_Checklist_ITEES.docx
+++ b/download/Submission_Checklist_ITEES.docx
@@ -761,7 +761,7 @@
                 <w:sz w:val="21"/>
                 <w:szCs w:val="21"/>
               </w:rPr>
-              <w:t xml:space="preserve">paper_itees/main_itees.pdf — title page with all four authors + affiliation + correspondence, 250-word abstract, 9 keywords, sections 1–5, Table 1 capability matrix, Tables 2–12, Figures 1–4, Funding / Conflict of Interest / Data Availability / Author Contributions declarations, 39 references. Upload the PDF for initial submission.</w:t>
+              <w:t xml:space="preserve">paper_itees/main_itees.pdf — title page with all four authors + affiliation + correspondence, 250-word abstract, 9 keywords, sections 1–5, Table 1 capability matrix, Tables 2–12, Figures 1–4, Funding / Conflict of Interest / Data Availability / Author Contributions declarations, 38 references. Upload the PDF for initial submission.</w:t>
             </w:r>
           </w:p>
         </w:tc>
@@ -1103,7 +1103,7 @@
                 <w:sz w:val="21"/>
                 <w:szCs w:val="21"/>
               </w:rPr>
-              <w:t xml:space="preserve">39 entries, all verified against publisher records (2026-10-30); ordered by first citation; months stripped per journal style. Entry [10] (the framework paper in this journal) is final. Entry [18] cites the companion study as “manuscript under review” — update its venue if it is accepted before submission.</w:t>
+              <w:t xml:space="preserve">38 entries, all verified against publisher records (2026-10-30); ordered by first citation; months stripped per journal style. Entry [10] (the framework paper, published in this journal, DOI 10.1155/etep/6000810) is final and Crossref-verified. The earlier under-review companion entry was removed at the authors’ decision (unverifiable, no DOI possible); the recalibration arms were reframed as this study’s own experiment.</w:t>
             </w:r>
           </w:p>
         </w:tc>

</xml_diff>